<commit_message>
Bổ sung responsive mobile cho index.html; cập nhật mẫu biên bản giám định
- Thêm 3 breakpoint (768px, 640px, 400px) để tối ưu giao diện điện thoại
- Header compact 52px, ẩn sub-title và ngày trên màn hình nhỏ
- Stepper sticky đúng top, ẩn nhãn "Bước N" trên mobile
- Form grid chuyển về 1–2 cột, nút action full-width xếp dọc
- Khu vực scan AI, nút step 1, action bar, file xuất đều responsive
- Toast căn giữa đáy, preview modal toàn màn hình trên mobile
- Cập nhật mẫu Biên-bản-giám-định.docx: bổ sung placeholder {sttN}

Co-Authored-By: Claude Sonnet 4.6 <noreply@anthropic.com>
</commit_message>
<xml_diff>
--- a/assets/Biên-bản-giám-định.docx
+++ b/assets/Biên-bản-giám-định.docx
@@ -224,36 +224,38 @@
     </w:tbl>
     <w:p>
       <w:pPr>
-        <w:pStyle w:val="Heading7"/>
-        <w:spacing w:before="120" w:after="120"/>
-        <w:ind w:right="181"/>
+        <w:pStyle w:val="BodyText"/>
+        <w:tabs>
+          <w:tab w:val="center" w:leader="dot" w:pos="9639"/>
+        </w:tabs>
+        <w:spacing w:before="120"/>
+        <w:ind w:right="-48"/>
         <w:rPr>
-          <w:rFonts w:ascii="Times New Roman" w:hAnsi="Times New Roman"/>
-          <w:b/>
-          <w:i w:val="0"/>
-          <w:sz w:val="28"/>
-          <w:szCs w:val="28"/>
+          <w:sz w:val="26"/>
+          <w:szCs w:val="26"/>
+        </w:rPr>
+      </w:pPr>
+    </w:p>
+    <w:p>
+      <w:pPr>
+        <w:pStyle w:val="BodyText"/>
+        <w:tabs>
+          <w:tab w:val="center" w:leader="dot" w:pos="9639"/>
+        </w:tabs>
+        <w:spacing w:before="120"/>
+        <w:ind w:right="-48"/>
+        <w:jc w:val="center"/>
+        <w:rPr>
+          <w:sz w:val="36"/>
+          <w:szCs w:val="36"/>
         </w:rPr>
       </w:pPr>
       <w:r>
         <w:rPr>
-          <w:rFonts w:ascii="Times New Roman" w:hAnsi="Times New Roman"/>
-          <w:b/>
-          <w:i w:val="0"/>
-          <w:sz w:val="28"/>
-          <w:szCs w:val="28"/>
+          <w:sz w:val="36"/>
+          <w:szCs w:val="36"/>
         </w:rPr>
-        <w:t>BIÊN BẢN GIÁM ĐỊNH</w:t>
-      </w:r>
-      <w:r>
-        <w:rPr>
-          <w:rFonts w:ascii="Times New Roman" w:hAnsi="Times New Roman"/>
-          <w:b/>
-          <w:i w:val="0"/>
-          <w:sz w:val="28"/>
-          <w:szCs w:val="28"/>
-        </w:rPr>
-        <w:t xml:space="preserve"> THIỆT HẠI</w:t>
+        <w:t>BIÊN BẢN GIÁM ĐỊNH THIỆT HẠI</w:t>
       </w:r>
     </w:p>
     <w:p>
@@ -268,9 +270,7 @@
         <w:ind w:right="72"/>
         <w:jc w:val="center"/>
         <w:rPr>
-          <w:rFonts w:ascii="Times New Roman" w:hAnsi="Times New Roman"/>
-          <w:sz w:val="26"/>
-          <w:szCs w:val="26"/>
+          <w:rStyle w:val="fontstyle01"/>
         </w:rPr>
       </w:pPr>
       <w:r>
@@ -306,11 +306,9 @@
         </w:tabs>
         <w:spacing w:before="120" w:after="120"/>
         <w:ind w:right="72"/>
-        <w:jc w:val="right"/>
+        <w:jc w:val="center"/>
         <w:rPr>
-          <w:rFonts w:ascii="Times New Roman" w:hAnsi="Times New Roman"/>
-          <w:sz w:val="26"/>
-          <w:szCs w:val="26"/>
+          <w:rStyle w:val="fontstyle01"/>
         </w:rPr>
       </w:pPr>
     </w:p>
@@ -1070,14 +1068,35 @@
           <w:sz w:val="26"/>
           <w:szCs w:val="26"/>
         </w:rPr>
-        <w:t>Do Công ty bảo hiểm bưu điện</w:t>
+        <w:t xml:space="preserve">Do Công ty </w:t>
       </w:r>
       <w:r>
         <w:rPr>
           <w:sz w:val="26"/>
           <w:szCs w:val="26"/>
         </w:rPr>
-        <w:t xml:space="preserve"> {don_vi_quan_ly}</w:t>
+        <w:t>B</w:t>
+      </w:r>
+      <w:r>
+        <w:rPr>
+          <w:sz w:val="26"/>
+          <w:szCs w:val="26"/>
+        </w:rPr>
+        <w:t xml:space="preserve">ảo hiểm </w:t>
+      </w:r>
+      <w:r>
+        <w:rPr>
+          <w:sz w:val="26"/>
+          <w:szCs w:val="26"/>
+        </w:rPr>
+        <w:t>B</w:t>
+      </w:r>
+      <w:r>
+        <w:rPr>
+          <w:sz w:val="26"/>
+          <w:szCs w:val="26"/>
+        </w:rPr>
+        <w:t>ưu điện</w:t>
       </w:r>
       <w:r>
         <w:rPr>
@@ -1085,6 +1104,13 @@
           <w:szCs w:val="26"/>
         </w:rPr>
         <w:t xml:space="preserve"> </w:t>
+      </w:r>
+      <w:r>
+        <w:rPr>
+          <w:sz w:val="26"/>
+          <w:szCs w:val="26"/>
+        </w:rPr>
+        <w:t>…………………</w:t>
       </w:r>
       <w:r>
         <w:rPr>
@@ -2004,6 +2030,14 @@
                 <w:szCs w:val="22"/>
               </w:rPr>
             </w:pPr>
+            <w:r>
+              <w:rPr>
+                <w:rFonts w:ascii="Times New Roman" w:hAnsi="Times New Roman"/>
+                <w:sz w:val="22"/>
+                <w:szCs w:val="22"/>
+              </w:rPr>
+              <w:t>{stt1}</w:t>
+            </w:r>
           </w:p>
         </w:tc>
         <w:tc>
@@ -2184,6 +2218,31 @@
                 <w:szCs w:val="22"/>
               </w:rPr>
             </w:pPr>
+            <w:r>
+              <w:rPr>
+                <w:rFonts w:ascii="Times New Roman" w:hAnsi="Times New Roman"/>
+                <w:sz w:val="22"/>
+                <w:szCs w:val="22"/>
+              </w:rPr>
+              <w:lastRenderedPageBreak/>
+              <w:t>{stt</w:t>
+            </w:r>
+            <w:r>
+              <w:rPr>
+                <w:rFonts w:ascii="Times New Roman" w:hAnsi="Times New Roman"/>
+                <w:sz w:val="22"/>
+                <w:szCs w:val="22"/>
+              </w:rPr>
+              <w:t>2</w:t>
+            </w:r>
+            <w:r>
+              <w:rPr>
+                <w:rFonts w:ascii="Times New Roman" w:hAnsi="Times New Roman"/>
+                <w:sz w:val="22"/>
+                <w:szCs w:val="22"/>
+              </w:rPr>
+              <w:t>}</w:t>
+            </w:r>
           </w:p>
         </w:tc>
         <w:tc>
@@ -2364,6 +2423,30 @@
                 <w:szCs w:val="22"/>
               </w:rPr>
             </w:pPr>
+            <w:r>
+              <w:rPr>
+                <w:rFonts w:ascii="Times New Roman" w:hAnsi="Times New Roman"/>
+                <w:sz w:val="22"/>
+                <w:szCs w:val="22"/>
+              </w:rPr>
+              <w:t>{stt</w:t>
+            </w:r>
+            <w:r>
+              <w:rPr>
+                <w:rFonts w:ascii="Times New Roman" w:hAnsi="Times New Roman"/>
+                <w:sz w:val="22"/>
+                <w:szCs w:val="22"/>
+              </w:rPr>
+              <w:t>3</w:t>
+            </w:r>
+            <w:r>
+              <w:rPr>
+                <w:rFonts w:ascii="Times New Roman" w:hAnsi="Times New Roman"/>
+                <w:sz w:val="22"/>
+                <w:szCs w:val="22"/>
+              </w:rPr>
+              <w:t>}</w:t>
+            </w:r>
           </w:p>
         </w:tc>
         <w:tc>
@@ -2544,6 +2627,30 @@
                 <w:szCs w:val="22"/>
               </w:rPr>
             </w:pPr>
+            <w:r>
+              <w:rPr>
+                <w:rFonts w:ascii="Times New Roman" w:hAnsi="Times New Roman"/>
+                <w:sz w:val="22"/>
+                <w:szCs w:val="22"/>
+              </w:rPr>
+              <w:t>{stt</w:t>
+            </w:r>
+            <w:r>
+              <w:rPr>
+                <w:rFonts w:ascii="Times New Roman" w:hAnsi="Times New Roman"/>
+                <w:sz w:val="22"/>
+                <w:szCs w:val="22"/>
+              </w:rPr>
+              <w:t>4</w:t>
+            </w:r>
+            <w:r>
+              <w:rPr>
+                <w:rFonts w:ascii="Times New Roman" w:hAnsi="Times New Roman"/>
+                <w:sz w:val="22"/>
+                <w:szCs w:val="22"/>
+              </w:rPr>
+              <w:t>}</w:t>
+            </w:r>
           </w:p>
         </w:tc>
         <w:tc>
@@ -2724,6 +2831,30 @@
                 <w:szCs w:val="22"/>
               </w:rPr>
             </w:pPr>
+            <w:r>
+              <w:rPr>
+                <w:rFonts w:ascii="Times New Roman" w:hAnsi="Times New Roman"/>
+                <w:sz w:val="22"/>
+                <w:szCs w:val="22"/>
+              </w:rPr>
+              <w:t>{stt</w:t>
+            </w:r>
+            <w:r>
+              <w:rPr>
+                <w:rFonts w:ascii="Times New Roman" w:hAnsi="Times New Roman"/>
+                <w:sz w:val="22"/>
+                <w:szCs w:val="22"/>
+              </w:rPr>
+              <w:t>5</w:t>
+            </w:r>
+            <w:r>
+              <w:rPr>
+                <w:rFonts w:ascii="Times New Roman" w:hAnsi="Times New Roman"/>
+                <w:sz w:val="22"/>
+                <w:szCs w:val="22"/>
+              </w:rPr>
+              <w:t>}</w:t>
+            </w:r>
           </w:p>
         </w:tc>
         <w:tc>
@@ -2904,6 +3035,30 @@
                 <w:szCs w:val="22"/>
               </w:rPr>
             </w:pPr>
+            <w:r>
+              <w:rPr>
+                <w:rFonts w:ascii="Times New Roman" w:hAnsi="Times New Roman"/>
+                <w:sz w:val="22"/>
+                <w:szCs w:val="22"/>
+              </w:rPr>
+              <w:t>{stt</w:t>
+            </w:r>
+            <w:r>
+              <w:rPr>
+                <w:rFonts w:ascii="Times New Roman" w:hAnsi="Times New Roman"/>
+                <w:sz w:val="22"/>
+                <w:szCs w:val="22"/>
+              </w:rPr>
+              <w:t>6</w:t>
+            </w:r>
+            <w:r>
+              <w:rPr>
+                <w:rFonts w:ascii="Times New Roman" w:hAnsi="Times New Roman"/>
+                <w:sz w:val="22"/>
+                <w:szCs w:val="22"/>
+              </w:rPr>
+              <w:t>}</w:t>
+            </w:r>
           </w:p>
         </w:tc>
         <w:tc>
@@ -3084,6 +3239,30 @@
                 <w:szCs w:val="22"/>
               </w:rPr>
             </w:pPr>
+            <w:r>
+              <w:rPr>
+                <w:rFonts w:ascii="Times New Roman" w:hAnsi="Times New Roman"/>
+                <w:sz w:val="22"/>
+                <w:szCs w:val="22"/>
+              </w:rPr>
+              <w:t>{stt</w:t>
+            </w:r>
+            <w:r>
+              <w:rPr>
+                <w:rFonts w:ascii="Times New Roman" w:hAnsi="Times New Roman"/>
+                <w:sz w:val="22"/>
+                <w:szCs w:val="22"/>
+              </w:rPr>
+              <w:t>7</w:t>
+            </w:r>
+            <w:r>
+              <w:rPr>
+                <w:rFonts w:ascii="Times New Roman" w:hAnsi="Times New Roman"/>
+                <w:sz w:val="22"/>
+                <w:szCs w:val="22"/>
+              </w:rPr>
+              <w:t>}</w:t>
+            </w:r>
           </w:p>
         </w:tc>
         <w:tc>
@@ -3119,7 +3298,7 @@
                 <w:sz w:val="26"/>
                 <w:szCs w:val="26"/>
               </w:rPr>
-              <w:t>8</w:t>
+              <w:t>7</w:t>
             </w:r>
             <w:r>
               <w:rPr>
@@ -3264,6 +3443,30 @@
                 <w:szCs w:val="22"/>
               </w:rPr>
             </w:pPr>
+            <w:r>
+              <w:rPr>
+                <w:rFonts w:ascii="Times New Roman" w:hAnsi="Times New Roman"/>
+                <w:sz w:val="22"/>
+                <w:szCs w:val="22"/>
+              </w:rPr>
+              <w:t>{stt</w:t>
+            </w:r>
+            <w:r>
+              <w:rPr>
+                <w:rFonts w:ascii="Times New Roman" w:hAnsi="Times New Roman"/>
+                <w:sz w:val="22"/>
+                <w:szCs w:val="22"/>
+              </w:rPr>
+              <w:t>8</w:t>
+            </w:r>
+            <w:r>
+              <w:rPr>
+                <w:rFonts w:ascii="Times New Roman" w:hAnsi="Times New Roman"/>
+                <w:sz w:val="22"/>
+                <w:szCs w:val="22"/>
+              </w:rPr>
+              <w:t>}</w:t>
+            </w:r>
           </w:p>
         </w:tc>
         <w:tc>
@@ -3299,7 +3502,7 @@
                 <w:sz w:val="26"/>
                 <w:szCs w:val="26"/>
               </w:rPr>
-              <w:t>9</w:t>
+              <w:t>8</w:t>
             </w:r>
             <w:r>
               <w:rPr>
@@ -3444,6 +3647,30 @@
                 <w:szCs w:val="22"/>
               </w:rPr>
             </w:pPr>
+            <w:r>
+              <w:rPr>
+                <w:rFonts w:ascii="Times New Roman" w:hAnsi="Times New Roman"/>
+                <w:sz w:val="22"/>
+                <w:szCs w:val="22"/>
+              </w:rPr>
+              <w:t>{stt</w:t>
+            </w:r>
+            <w:r>
+              <w:rPr>
+                <w:rFonts w:ascii="Times New Roman" w:hAnsi="Times New Roman"/>
+                <w:sz w:val="22"/>
+                <w:szCs w:val="22"/>
+              </w:rPr>
+              <w:t>9</w:t>
+            </w:r>
+            <w:r>
+              <w:rPr>
+                <w:rFonts w:ascii="Times New Roman" w:hAnsi="Times New Roman"/>
+                <w:sz w:val="22"/>
+                <w:szCs w:val="22"/>
+              </w:rPr>
+              <w:t>}</w:t>
+            </w:r>
           </w:p>
         </w:tc>
         <w:tc>
@@ -3479,7 +3706,7 @@
                 <w:sz w:val="26"/>
                 <w:szCs w:val="26"/>
               </w:rPr>
-              <w:t>10</w:t>
+              <w:t>9</w:t>
             </w:r>
             <w:r>
               <w:rPr>
@@ -3624,6 +3851,30 @@
                 <w:szCs w:val="22"/>
               </w:rPr>
             </w:pPr>
+            <w:r>
+              <w:rPr>
+                <w:rFonts w:ascii="Times New Roman" w:hAnsi="Times New Roman"/>
+                <w:sz w:val="22"/>
+                <w:szCs w:val="22"/>
+              </w:rPr>
+              <w:t>{stt</w:t>
+            </w:r>
+            <w:r>
+              <w:rPr>
+                <w:rFonts w:ascii="Times New Roman" w:hAnsi="Times New Roman"/>
+                <w:sz w:val="22"/>
+                <w:szCs w:val="22"/>
+              </w:rPr>
+              <w:t>10</w:t>
+            </w:r>
+            <w:r>
+              <w:rPr>
+                <w:rFonts w:ascii="Times New Roman" w:hAnsi="Times New Roman"/>
+                <w:sz w:val="22"/>
+                <w:szCs w:val="22"/>
+              </w:rPr>
+              <w:t>}</w:t>
+            </w:r>
           </w:p>
         </w:tc>
         <w:tc>
@@ -3651,15 +3902,15 @@
                 <w:sz w:val="26"/>
                 <w:szCs w:val="26"/>
               </w:rPr>
-              <w:t>{ten_phu_tung_1</w:t>
-            </w:r>
-            <w:r>
-              <w:rPr>
-                <w:rFonts w:ascii="Times New Roman" w:hAnsi="Times New Roman"/>
-                <w:sz w:val="26"/>
-                <w:szCs w:val="26"/>
-              </w:rPr>
-              <w:t>1</w:t>
+              <w:t>{ten_phu_tung_</w:t>
+            </w:r>
+            <w:r>
+              <w:rPr>
+                <w:rFonts w:ascii="Times New Roman" w:hAnsi="Times New Roman"/>
+                <w:sz w:val="26"/>
+                <w:szCs w:val="26"/>
+              </w:rPr>
+              <w:t>10</w:t>
             </w:r>
             <w:r>
               <w:rPr>
@@ -3804,6 +4055,30 @@
                 <w:szCs w:val="22"/>
               </w:rPr>
             </w:pPr>
+            <w:r>
+              <w:rPr>
+                <w:rFonts w:ascii="Times New Roman" w:hAnsi="Times New Roman"/>
+                <w:sz w:val="22"/>
+                <w:szCs w:val="22"/>
+              </w:rPr>
+              <w:t>{stt</w:t>
+            </w:r>
+            <w:r>
+              <w:rPr>
+                <w:rFonts w:ascii="Times New Roman" w:hAnsi="Times New Roman"/>
+                <w:sz w:val="22"/>
+                <w:szCs w:val="22"/>
+              </w:rPr>
+              <w:t>11</w:t>
+            </w:r>
+            <w:r>
+              <w:rPr>
+                <w:rFonts w:ascii="Times New Roman" w:hAnsi="Times New Roman"/>
+                <w:sz w:val="22"/>
+                <w:szCs w:val="22"/>
+              </w:rPr>
+              <w:t>}</w:t>
+            </w:r>
           </w:p>
         </w:tc>
         <w:tc>
@@ -3839,7 +4114,7 @@
                 <w:sz w:val="26"/>
                 <w:szCs w:val="26"/>
               </w:rPr>
-              <w:t>2</w:t>
+              <w:t>1</w:t>
             </w:r>
             <w:r>
               <w:rPr>
@@ -3984,6 +4259,30 @@
                 <w:szCs w:val="22"/>
               </w:rPr>
             </w:pPr>
+            <w:r>
+              <w:rPr>
+                <w:rFonts w:ascii="Times New Roman" w:hAnsi="Times New Roman"/>
+                <w:sz w:val="22"/>
+                <w:szCs w:val="22"/>
+              </w:rPr>
+              <w:t>{stt</w:t>
+            </w:r>
+            <w:r>
+              <w:rPr>
+                <w:rFonts w:ascii="Times New Roman" w:hAnsi="Times New Roman"/>
+                <w:sz w:val="22"/>
+                <w:szCs w:val="22"/>
+              </w:rPr>
+              <w:t>12</w:t>
+            </w:r>
+            <w:r>
+              <w:rPr>
+                <w:rFonts w:ascii="Times New Roman" w:hAnsi="Times New Roman"/>
+                <w:sz w:val="22"/>
+                <w:szCs w:val="22"/>
+              </w:rPr>
+              <w:t>}</w:t>
+            </w:r>
           </w:p>
         </w:tc>
         <w:tc>
@@ -4019,7 +4318,7 @@
                 <w:sz w:val="26"/>
                 <w:szCs w:val="26"/>
               </w:rPr>
-              <w:t>3</w:t>
+              <w:t>2</w:t>
             </w:r>
             <w:r>
               <w:rPr>
@@ -4164,6 +4463,30 @@
                 <w:szCs w:val="22"/>
               </w:rPr>
             </w:pPr>
+            <w:r>
+              <w:rPr>
+                <w:rFonts w:ascii="Times New Roman" w:hAnsi="Times New Roman"/>
+                <w:sz w:val="22"/>
+                <w:szCs w:val="22"/>
+              </w:rPr>
+              <w:t>{stt</w:t>
+            </w:r>
+            <w:r>
+              <w:rPr>
+                <w:rFonts w:ascii="Times New Roman" w:hAnsi="Times New Roman"/>
+                <w:sz w:val="22"/>
+                <w:szCs w:val="22"/>
+              </w:rPr>
+              <w:t>13</w:t>
+            </w:r>
+            <w:r>
+              <w:rPr>
+                <w:rFonts w:ascii="Times New Roman" w:hAnsi="Times New Roman"/>
+                <w:sz w:val="22"/>
+                <w:szCs w:val="22"/>
+              </w:rPr>
+              <w:t>}</w:t>
+            </w:r>
           </w:p>
         </w:tc>
         <w:tc>
@@ -4185,6 +4508,30 @@
                 <w:szCs w:val="22"/>
               </w:rPr>
             </w:pPr>
+            <w:r>
+              <w:rPr>
+                <w:rFonts w:ascii="Times New Roman" w:hAnsi="Times New Roman"/>
+                <w:sz w:val="26"/>
+                <w:szCs w:val="26"/>
+              </w:rPr>
+              <w:t>{ten_phu_tung_1</w:t>
+            </w:r>
+            <w:r>
+              <w:rPr>
+                <w:rFonts w:ascii="Times New Roman" w:hAnsi="Times New Roman"/>
+                <w:sz w:val="26"/>
+                <w:szCs w:val="26"/>
+              </w:rPr>
+              <w:t>3</w:t>
+            </w:r>
+            <w:r>
+              <w:rPr>
+                <w:rFonts w:ascii="Times New Roman" w:hAnsi="Times New Roman"/>
+                <w:sz w:val="26"/>
+                <w:szCs w:val="26"/>
+              </w:rPr>
+              <w:t>}</w:t>
+            </w:r>
           </w:p>
         </w:tc>
         <w:tc>
@@ -4320,6 +4667,30 @@
                 <w:szCs w:val="22"/>
               </w:rPr>
             </w:pPr>
+            <w:r>
+              <w:rPr>
+                <w:rFonts w:ascii="Times New Roman" w:hAnsi="Times New Roman"/>
+                <w:sz w:val="22"/>
+                <w:szCs w:val="22"/>
+              </w:rPr>
+              <w:t>{stt</w:t>
+            </w:r>
+            <w:r>
+              <w:rPr>
+                <w:rFonts w:ascii="Times New Roman" w:hAnsi="Times New Roman"/>
+                <w:sz w:val="22"/>
+                <w:szCs w:val="22"/>
+              </w:rPr>
+              <w:t>14</w:t>
+            </w:r>
+            <w:r>
+              <w:rPr>
+                <w:rFonts w:ascii="Times New Roman" w:hAnsi="Times New Roman"/>
+                <w:sz w:val="22"/>
+                <w:szCs w:val="22"/>
+              </w:rPr>
+              <w:t>}</w:t>
+            </w:r>
           </w:p>
         </w:tc>
         <w:tc>
@@ -4341,6 +4712,30 @@
                 <w:szCs w:val="22"/>
               </w:rPr>
             </w:pPr>
+            <w:r>
+              <w:rPr>
+                <w:rFonts w:ascii="Times New Roman" w:hAnsi="Times New Roman"/>
+                <w:sz w:val="26"/>
+                <w:szCs w:val="26"/>
+              </w:rPr>
+              <w:t>{ten_phu_tung_1</w:t>
+            </w:r>
+            <w:r>
+              <w:rPr>
+                <w:rFonts w:ascii="Times New Roman" w:hAnsi="Times New Roman"/>
+                <w:sz w:val="26"/>
+                <w:szCs w:val="26"/>
+              </w:rPr>
+              <w:t>4</w:t>
+            </w:r>
+            <w:r>
+              <w:rPr>
+                <w:rFonts w:ascii="Times New Roman" w:hAnsi="Times New Roman"/>
+                <w:sz w:val="26"/>
+                <w:szCs w:val="26"/>
+              </w:rPr>
+              <w:t>}</w:t>
+            </w:r>
           </w:p>
         </w:tc>
         <w:tc>
@@ -4476,6 +4871,30 @@
                 <w:szCs w:val="22"/>
               </w:rPr>
             </w:pPr>
+            <w:r>
+              <w:rPr>
+                <w:rFonts w:ascii="Times New Roman" w:hAnsi="Times New Roman"/>
+                <w:sz w:val="22"/>
+                <w:szCs w:val="22"/>
+              </w:rPr>
+              <w:t>{stt</w:t>
+            </w:r>
+            <w:r>
+              <w:rPr>
+                <w:rFonts w:ascii="Times New Roman" w:hAnsi="Times New Roman"/>
+                <w:sz w:val="22"/>
+                <w:szCs w:val="22"/>
+              </w:rPr>
+              <w:t>15</w:t>
+            </w:r>
+            <w:r>
+              <w:rPr>
+                <w:rFonts w:ascii="Times New Roman" w:hAnsi="Times New Roman"/>
+                <w:sz w:val="22"/>
+                <w:szCs w:val="22"/>
+              </w:rPr>
+              <w:t>}</w:t>
+            </w:r>
           </w:p>
         </w:tc>
         <w:tc>
@@ -4497,6 +4916,30 @@
                 <w:szCs w:val="22"/>
               </w:rPr>
             </w:pPr>
+            <w:r>
+              <w:rPr>
+                <w:rFonts w:ascii="Times New Roman" w:hAnsi="Times New Roman"/>
+                <w:sz w:val="26"/>
+                <w:szCs w:val="26"/>
+              </w:rPr>
+              <w:t>{ten_phu_tung_1</w:t>
+            </w:r>
+            <w:r>
+              <w:rPr>
+                <w:rFonts w:ascii="Times New Roman" w:hAnsi="Times New Roman"/>
+                <w:sz w:val="26"/>
+                <w:szCs w:val="26"/>
+              </w:rPr>
+              <w:t>4</w:t>
+            </w:r>
+            <w:r>
+              <w:rPr>
+                <w:rFonts w:ascii="Times New Roman" w:hAnsi="Times New Roman"/>
+                <w:sz w:val="26"/>
+                <w:szCs w:val="26"/>
+              </w:rPr>
+              <w:t>}</w:t>
+            </w:r>
           </w:p>
         </w:tc>
         <w:tc>
@@ -4632,6 +5075,30 @@
                 <w:szCs w:val="22"/>
               </w:rPr>
             </w:pPr>
+            <w:r>
+              <w:rPr>
+                <w:rFonts w:ascii="Times New Roman" w:hAnsi="Times New Roman"/>
+                <w:sz w:val="22"/>
+                <w:szCs w:val="22"/>
+              </w:rPr>
+              <w:t>{stt</w:t>
+            </w:r>
+            <w:r>
+              <w:rPr>
+                <w:rFonts w:ascii="Times New Roman" w:hAnsi="Times New Roman"/>
+                <w:sz w:val="22"/>
+                <w:szCs w:val="22"/>
+              </w:rPr>
+              <w:t>16</w:t>
+            </w:r>
+            <w:r>
+              <w:rPr>
+                <w:rFonts w:ascii="Times New Roman" w:hAnsi="Times New Roman"/>
+                <w:sz w:val="22"/>
+                <w:szCs w:val="22"/>
+              </w:rPr>
+              <w:t>}</w:t>
+            </w:r>
           </w:p>
         </w:tc>
         <w:tc>
@@ -4653,6 +5120,30 @@
                 <w:szCs w:val="22"/>
               </w:rPr>
             </w:pPr>
+            <w:r>
+              <w:rPr>
+                <w:rFonts w:ascii="Times New Roman" w:hAnsi="Times New Roman"/>
+                <w:sz w:val="26"/>
+                <w:szCs w:val="26"/>
+              </w:rPr>
+              <w:t>{ten_phu_tung_1</w:t>
+            </w:r>
+            <w:r>
+              <w:rPr>
+                <w:rFonts w:ascii="Times New Roman" w:hAnsi="Times New Roman"/>
+                <w:sz w:val="26"/>
+                <w:szCs w:val="26"/>
+              </w:rPr>
+              <w:t>6</w:t>
+            </w:r>
+            <w:r>
+              <w:rPr>
+                <w:rFonts w:ascii="Times New Roman" w:hAnsi="Times New Roman"/>
+                <w:sz w:val="26"/>
+                <w:szCs w:val="26"/>
+              </w:rPr>
+              <w:t>}</w:t>
+            </w:r>
           </w:p>
         </w:tc>
         <w:tc>
@@ -4788,6 +5279,30 @@
                 <w:szCs w:val="22"/>
               </w:rPr>
             </w:pPr>
+            <w:r>
+              <w:rPr>
+                <w:rFonts w:ascii="Times New Roman" w:hAnsi="Times New Roman"/>
+                <w:sz w:val="22"/>
+                <w:szCs w:val="22"/>
+              </w:rPr>
+              <w:t>{stt1</w:t>
+            </w:r>
+            <w:r>
+              <w:rPr>
+                <w:rFonts w:ascii="Times New Roman" w:hAnsi="Times New Roman"/>
+                <w:sz w:val="22"/>
+                <w:szCs w:val="22"/>
+              </w:rPr>
+              <w:t>7</w:t>
+            </w:r>
+            <w:r>
+              <w:rPr>
+                <w:rFonts w:ascii="Times New Roman" w:hAnsi="Times New Roman"/>
+                <w:sz w:val="22"/>
+                <w:szCs w:val="22"/>
+              </w:rPr>
+              <w:t>}</w:t>
+            </w:r>
           </w:p>
         </w:tc>
         <w:tc>
@@ -4809,6 +5324,30 @@
                 <w:szCs w:val="22"/>
               </w:rPr>
             </w:pPr>
+            <w:r>
+              <w:rPr>
+                <w:rFonts w:ascii="Times New Roman" w:hAnsi="Times New Roman"/>
+                <w:sz w:val="26"/>
+                <w:szCs w:val="26"/>
+              </w:rPr>
+              <w:t>{ten_phu_tung_1</w:t>
+            </w:r>
+            <w:r>
+              <w:rPr>
+                <w:rFonts w:ascii="Times New Roman" w:hAnsi="Times New Roman"/>
+                <w:sz w:val="26"/>
+                <w:szCs w:val="26"/>
+              </w:rPr>
+              <w:t>7</w:t>
+            </w:r>
+            <w:r>
+              <w:rPr>
+                <w:rFonts w:ascii="Times New Roman" w:hAnsi="Times New Roman"/>
+                <w:sz w:val="26"/>
+                <w:szCs w:val="26"/>
+              </w:rPr>
+              <w:t>}</w:t>
+            </w:r>
           </w:p>
         </w:tc>
         <w:tc>

</xml_diff>